<commit_message>
Point the proposal at the online two-path demo
The PDF and Word versions now describe the online demo faculty can try
(link, password sent separately, new and established faculty paths)
instead of the three local HTML files and four personas. Appendix A is
rewritten with screenshots of the onboarding and both dashboards.
The proposal's source files are kept in proposal-src/.

Co-Authored-By: Claude Opus 5.5 <noreply@anthropic.com>
Claude-Session: https://claude.ai/code/session_01Da9hsk65BwNStoX3Txt7MF
</commit_message>
<xml_diff>
--- a/demos/vinuni-faculty-community/International-Faculty-Community-Pilot-Proposal.docx
+++ b/demos/vinuni-faculty-community/International-Faculty-Community-Pilot-Proposal.docx
@@ -581,7 +581,7 @@
         </w:rPr>
         <w:t>Guest access for partners and families</w:t>
         <w:tab/>
-        <w:t>8</w:t>
+        <w:t>9</w:t>
       </w:r>
     </w:p>
     <w:p>
@@ -1107,7 +1107,7 @@
         <w:rPr>
           <w:b/>
         </w:rPr>
-        <w:t>Using the demo</w:t>
+        <w:t>Trying the online demo</w:t>
         <w:tab/>
         <w:t>28</w:t>
       </w:r>
@@ -1133,7 +1133,7 @@
         </w:rPr>
         <w:t>Traceability to the original MVP criteria</w:t>
         <w:tab/>
-        <w:t>29</w:t>
+        <w:t>30</w:t>
       </w:r>
     </w:p>
     <w:p>
@@ -1157,7 +1157,7 @@
         </w:rPr>
         <w:t>Feature inventory</w:t>
         <w:tab/>
-        <w:t>30</w:t>
+        <w:t>31</w:t>
       </w:r>
       <w:r>
         <w:fldChar w:fldCharType="end"/>
@@ -1227,7 +1227,15 @@
           <w:p>
             <w:r>
               <w:rPr/>
-              <w:t xml:space="preserve">This proposal comes with an interactive demo you can click through: three HTML files that open in any modern browser without an internet connection. Every screenshot in this document comes from that demo. </w:t>
+              <w:t xml:space="preserve">This proposal comes with an online demo that faculty can try: </w:t>
+            </w:r>
+            <w:r>
+              <w:rPr/>
+              <w:t>claude.ai/artifact/HKcpCfBua9uHhv5Y3hNKNc</w:t>
+            </w:r>
+            <w:r>
+              <w:rPr/>
+              <w:t xml:space="preserve"> (password provided separately). It shows the experience for new and established faculty. The screenshots in this document come from the full working prototype, which also includes the partner and coordinator screens described in Sections 5 and 6. </w:t>
             </w:r>
             <w:r>
               <w:rPr>
@@ -1238,7 +1246,7 @@
             </w:r>
             <w:r>
               <w:rPr/>
-              <w:t>, and the demo is a concept, not an official VinUniversity system. Appendix A explains how to open it.</w:t>
+              <w:t>, and the demo is a concept, not an official VinUniversity system. Appendix A explains how to try it.</w:t>
             </w:r>
           </w:p>
         </w:tc>
@@ -1592,7 +1600,7 @@
                 <w:color w:val="464E5E"/>
                 <w:sz w:val="17"/>
               </w:rPr>
-              <w:t>refinements to the original proposal, all shown in the demo</w:t>
+              <w:t>refinements to the original proposal, all built into the prototype</w:t>
             </w:r>
           </w:p>
         </w:tc>
@@ -3888,7 +3896,7 @@
           <w:color w:val="464E5E"/>
           <w:sz w:val="23"/>
         </w:rPr>
-        <w:t>Four groups use the platform, and each sees only what it needs. The demo lets you switch between one example person from each group.</w:t>
+        <w:t>Four groups use the platform, and each sees only what it needs. The online demo lets faculty try the first two, as a new or an established colleague.</w:t>
       </w:r>
     </w:p>
     <w:p>
@@ -3914,7 +3922,7 @@
         <w:rPr>
           <w:color w:val="737B8C"/>
         </w:rPr>
-        <w:t>Demo persona: Sofia, arriving in November with her partner and two children.</w:t>
+        <w:t>Example: Sofia, arriving in November with her partner and two children.</w:t>
       </w:r>
     </w:p>
     <w:p>
@@ -3940,7 +3948,7 @@
         <w:rPr>
           <w:color w:val="737B8C"/>
         </w:rPr>
-        <w:t>Demo persona: James, three years at the College of Business &amp; Management.</w:t>
+        <w:t>Example: James, three years at the College of Business &amp; Management.</w:t>
       </w:r>
     </w:p>
     <w:p>
@@ -3966,7 +3974,7 @@
         <w:rPr>
           <w:color w:val="737B8C"/>
         </w:rPr>
-        <w:t>Demo persona: Erik, Sofia’s partner.</w:t>
+        <w:t>Example: Erik, Sofia’s partner.</w:t>
       </w:r>
     </w:p>
     <w:p>
@@ -3992,67 +4000,7 @@
         <w:rPr>
           <w:color w:val="737B8C"/>
         </w:rPr>
-        <w:t>Demo persona: Linh, Faculty Affairs.</w:t>
-      </w:r>
-    </w:p>
-    <w:p>
-      <w:pPr>
-        <w:keepNext/>
-        <w:spacing w:after="60"/>
-        <w:jc w:val="center"/>
-      </w:pPr>
-      <w:r>
-        <w:drawing>
-          <wp:inline xmlns:a="http://schemas.openxmlformats.org/drawingml/2006/main" xmlns:pic="http://schemas.openxmlformats.org/drawingml/2006/picture">
-            <wp:extent cx="5324399" cy="3411165"/>
-            <wp:docPr id="5" name="Picture 5"/>
-            <wp:cNvGraphicFramePr>
-              <a:graphicFrameLocks noChangeAspect="1"/>
-            </wp:cNvGraphicFramePr>
-            <a:graphic>
-              <a:graphicData uri="http://schemas.openxmlformats.org/drawingml/2006/picture">
-                <pic:pic>
-                  <pic:nvPicPr>
-                    <pic:cNvPr id="0" name="signin.jpg"/>
-                    <pic:cNvPicPr/>
-                  </pic:nvPicPr>
-                  <pic:blipFill>
-                    <a:blip r:embed="rId13"/>
-                    <a:stretch>
-                      <a:fillRect/>
-                    </a:stretch>
-                  </pic:blipFill>
-                  <pic:spPr>
-                    <a:xfrm>
-                      <a:off x="0" y="0"/>
-                      <a:ext cx="5324399" cy="3411165"/>
-                    </a:xfrm>
-                    <a:prstGeom prst="rect"/>
-                  </pic:spPr>
-                </pic:pic>
-              </a:graphicData>
-            </a:graphic>
-          </wp:inline>
-        </w:drawing>
-      </w:r>
-    </w:p>
-    <w:p>
-      <w:pPr>
-        <w:pStyle w:val="Caption"/>
-        <w:jc w:val="center"/>
-      </w:pPr>
-      <w:r>
-        <w:rPr>
-          <w:b/>
-          <w:color w:val="737B8C"/>
-        </w:rPr>
-        <w:t>Figure.</w:t>
-      </w:r>
-      <w:r>
-        <w:rPr>
-          <w:color w:val="737B8C"/>
-        </w:rPr>
-        <w:t xml:space="preserve"> The demo’s entry screen. Each persona shows a different side of the platform, and actions carry across personas: a buddy request made as Sofia appears in Linh’s queue.</w:t>
+        <w:t>Example: Linh, Faculty Affairs.</w:t>
       </w:r>
     </w:p>
     <w:p>
@@ -4081,7 +4029,7 @@
           <w:color w:val="464E5E"/>
           <w:sz w:val="23"/>
         </w:rPr>
-        <w:t xml:space="preserve">This section walks through every feature in the demo, with what it does, why it matters and a screenshot. Each feature is marked </w:t>
+        <w:t xml:space="preserve">This section walks through every feature of the platform, with what it does, why it matters and a screenshot from the prototype. Each feature is marked </w:t>
       </w:r>
       <w:r>
         <w:rPr>
@@ -4111,7 +4059,7 @@
           <w:color w:val="464E5E"/>
           <w:sz w:val="23"/>
         </w:rPr>
-        <w:t xml:space="preserve"> if it would follow a successful pilot. The demo shows the full vision so the council can see where the pilot leads.</w:t>
+        <w:t xml:space="preserve"> if it would follow a successful pilot. The prototype shows the full vision so the council can see where the pilot leads. The online demo focuses on the faculty features in 5.1–5.13.</w:t>
       </w:r>
     </w:p>
     <w:p>
@@ -4189,7 +4137,7 @@
         <w:drawing>
           <wp:inline xmlns:a="http://schemas.openxmlformats.org/drawingml/2006/main" xmlns:pic="http://schemas.openxmlformats.org/drawingml/2006/picture">
             <wp:extent cx="6263999" cy="4497551"/>
-            <wp:docPr id="6" name="Picture 6"/>
+            <wp:docPr id="5" name="Picture 5"/>
             <wp:cNvGraphicFramePr>
               <a:graphicFrameLocks noChangeAspect="1"/>
             </wp:cNvGraphicFramePr>
@@ -4201,7 +4149,7 @@
                     <pic:cNvPicPr/>
                   </pic:nvPicPr>
                   <pic:blipFill>
-                    <a:blip r:embed="rId14"/>
+                    <a:blip r:embed="rId13"/>
                     <a:stretch>
                       <a:fillRect/>
                     </a:stretch>
@@ -4276,7 +4224,7 @@
               <w:drawing>
                 <wp:inline xmlns:a="http://schemas.openxmlformats.org/drawingml/2006/main" xmlns:pic="http://schemas.openxmlformats.org/drawingml/2006/picture">
                   <wp:extent cx="3405063" cy="1223553"/>
-                  <wp:docPr id="7" name="Picture 7"/>
+                  <wp:docPr id="6" name="Picture 6"/>
                   <wp:cNvGraphicFramePr>
                     <a:graphicFrameLocks noChangeAspect="1"/>
                   </wp:cNvGraphicFramePr>
@@ -4288,7 +4236,7 @@
                           <pic:cNvPicPr/>
                         </pic:nvPicPr>
                         <pic:blipFill>
-                          <a:blip r:embed="rId15"/>
+                          <a:blip r:embed="rId14"/>
                           <a:stretch>
                             <a:fillRect/>
                           </a:stretch>
@@ -4431,7 +4379,7 @@
         <w:drawing>
           <wp:inline xmlns:a="http://schemas.openxmlformats.org/drawingml/2006/main" xmlns:pic="http://schemas.openxmlformats.org/drawingml/2006/picture">
             <wp:extent cx="6263999" cy="2021184"/>
-            <wp:docPr id="8" name="Picture 8"/>
+            <wp:docPr id="7" name="Picture 7"/>
             <wp:cNvGraphicFramePr>
               <a:graphicFrameLocks noChangeAspect="1"/>
             </wp:cNvGraphicFramePr>
@@ -4443,7 +4391,7 @@
                     <pic:cNvPicPr/>
                   </pic:nvPicPr>
                   <pic:blipFill>
-                    <a:blip r:embed="rId16"/>
+                    <a:blip r:embed="rId15"/>
                     <a:stretch>
                       <a:fillRect/>
                     </a:stretch>
@@ -4518,7 +4466,7 @@
               <w:drawing>
                 <wp:inline xmlns:a="http://schemas.openxmlformats.org/drawingml/2006/main" xmlns:pic="http://schemas.openxmlformats.org/drawingml/2006/picture">
                   <wp:extent cx="3317039" cy="2332984"/>
-                  <wp:docPr id="9" name="Picture 9"/>
+                  <wp:docPr id="8" name="Picture 8"/>
                   <wp:cNvGraphicFramePr>
                     <a:graphicFrameLocks noChangeAspect="1"/>
                   </wp:cNvGraphicFramePr>
@@ -4530,7 +4478,7 @@
                           <pic:cNvPicPr/>
                         </pic:nvPicPr>
                         <pic:blipFill>
-                          <a:blip r:embed="rId17"/>
+                          <a:blip r:embed="rId16"/>
                           <a:stretch>
                             <a:fillRect/>
                           </a:stretch>
@@ -4767,7 +4715,7 @@
               <w:drawing>
                 <wp:inline xmlns:a="http://schemas.openxmlformats.org/drawingml/2006/main" xmlns:pic="http://schemas.openxmlformats.org/drawingml/2006/picture">
                   <wp:extent cx="2951999" cy="1619663"/>
-                  <wp:docPr id="10" name="Picture 10"/>
+                  <wp:docPr id="9" name="Picture 9"/>
                   <wp:cNvGraphicFramePr>
                     <a:graphicFrameLocks noChangeAspect="1"/>
                   </wp:cNvGraphicFramePr>
@@ -4779,7 +4727,7 @@
                           <pic:cNvPicPr/>
                         </pic:nvPicPr>
                         <pic:blipFill>
-                          <a:blip r:embed="rId18"/>
+                          <a:blip r:embed="rId17"/>
                           <a:stretch>
                             <a:fillRect/>
                           </a:stretch>
@@ -4836,7 +4784,7 @@
               <w:drawing>
                 <wp:inline xmlns:a="http://schemas.openxmlformats.org/drawingml/2006/main" xmlns:pic="http://schemas.openxmlformats.org/drawingml/2006/picture">
                   <wp:extent cx="2951999" cy="834862"/>
-                  <wp:docPr id="11" name="Picture 11"/>
+                  <wp:docPr id="10" name="Picture 10"/>
                   <wp:cNvGraphicFramePr>
                     <a:graphicFrameLocks noChangeAspect="1"/>
                   </wp:cNvGraphicFramePr>
@@ -4848,7 +4796,7 @@
                           <pic:cNvPicPr/>
                         </pic:nvPicPr>
                         <pic:blipFill>
-                          <a:blip r:embed="rId19"/>
+                          <a:blip r:embed="rId18"/>
                           <a:stretch>
                             <a:fillRect/>
                           </a:stretch>
@@ -5029,7 +4977,7 @@
               <w:drawing>
                 <wp:inline xmlns:a="http://schemas.openxmlformats.org/drawingml/2006/main" xmlns:pic="http://schemas.openxmlformats.org/drawingml/2006/picture">
                   <wp:extent cx="3317039" cy="3571345"/>
-                  <wp:docPr id="12" name="Picture 12"/>
+                  <wp:docPr id="11" name="Picture 11"/>
                   <wp:cNvGraphicFramePr>
                     <a:graphicFrameLocks noChangeAspect="1"/>
                   </wp:cNvGraphicFramePr>
@@ -5041,7 +4989,7 @@
                           <pic:cNvPicPr/>
                         </pic:nvPicPr>
                         <pic:blipFill>
-                          <a:blip r:embed="rId20"/>
+                          <a:blip r:embed="rId19"/>
                           <a:stretch>
                             <a:fillRect/>
                           </a:stretch>
@@ -5208,7 +5156,7 @@
               <w:drawing>
                 <wp:inline xmlns:a="http://schemas.openxmlformats.org/drawingml/2006/main" xmlns:pic="http://schemas.openxmlformats.org/drawingml/2006/picture">
                   <wp:extent cx="2586959" cy="3482445"/>
-                  <wp:docPr id="13" name="Picture 13"/>
+                  <wp:docPr id="12" name="Picture 12"/>
                   <wp:cNvGraphicFramePr>
                     <a:graphicFrameLocks noChangeAspect="1"/>
                   </wp:cNvGraphicFramePr>
@@ -5220,7 +5168,7 @@
                           <pic:cNvPicPr/>
                         </pic:nvPicPr>
                         <pic:blipFill>
-                          <a:blip r:embed="rId21"/>
+                          <a:blip r:embed="rId20"/>
                           <a:stretch>
                             <a:fillRect/>
                           </a:stretch>
@@ -5336,7 +5284,7 @@
               <w:drawing>
                 <wp:inline xmlns:a="http://schemas.openxmlformats.org/drawingml/2006/main" xmlns:pic="http://schemas.openxmlformats.org/drawingml/2006/picture">
                   <wp:extent cx="3405063" cy="2499316"/>
-                  <wp:docPr id="14" name="Picture 14"/>
+                  <wp:docPr id="13" name="Picture 13"/>
                   <wp:cNvGraphicFramePr>
                     <a:graphicFrameLocks noChangeAspect="1"/>
                   </wp:cNvGraphicFramePr>
@@ -5348,7 +5296,7 @@
                           <pic:cNvPicPr/>
                         </pic:nvPicPr>
                         <pic:blipFill>
-                          <a:blip r:embed="rId22"/>
+                          <a:blip r:embed="rId21"/>
                           <a:stretch>
                             <a:fillRect/>
                           </a:stretch>
@@ -5405,7 +5353,7 @@
               <w:drawing>
                 <wp:inline xmlns:a="http://schemas.openxmlformats.org/drawingml/2006/main" xmlns:pic="http://schemas.openxmlformats.org/drawingml/2006/picture">
                   <wp:extent cx="2498935" cy="3652290"/>
-                  <wp:docPr id="15" name="Picture 15"/>
+                  <wp:docPr id="14" name="Picture 14"/>
                   <wp:cNvGraphicFramePr>
                     <a:graphicFrameLocks noChangeAspect="1"/>
                   </wp:cNvGraphicFramePr>
@@ -5417,7 +5365,7 @@
                           <pic:cNvPicPr/>
                         </pic:nvPicPr>
                         <pic:blipFill>
-                          <a:blip r:embed="rId23"/>
+                          <a:blip r:embed="rId22"/>
                           <a:stretch>
                             <a:fillRect/>
                           </a:stretch>
@@ -5570,7 +5518,7 @@
               <w:drawing>
                 <wp:inline xmlns:a="http://schemas.openxmlformats.org/drawingml/2006/main" xmlns:pic="http://schemas.openxmlformats.org/drawingml/2006/picture">
                   <wp:extent cx="3405063" cy="2767181"/>
-                  <wp:docPr id="16" name="Picture 16"/>
+                  <wp:docPr id="15" name="Picture 15"/>
                   <wp:cNvGraphicFramePr>
                     <a:graphicFrameLocks noChangeAspect="1"/>
                   </wp:cNvGraphicFramePr>
@@ -5582,7 +5530,7 @@
                           <pic:cNvPicPr/>
                         </pic:nvPicPr>
                         <pic:blipFill>
-                          <a:blip r:embed="rId24"/>
+                          <a:blip r:embed="rId23"/>
                           <a:stretch>
                             <a:fillRect/>
                           </a:stretch>
@@ -5639,7 +5587,7 @@
               <w:drawing>
                 <wp:inline xmlns:a="http://schemas.openxmlformats.org/drawingml/2006/main" xmlns:pic="http://schemas.openxmlformats.org/drawingml/2006/picture">
                   <wp:extent cx="2498935" cy="3563773"/>
-                  <wp:docPr id="17" name="Picture 17"/>
+                  <wp:docPr id="16" name="Picture 16"/>
                   <wp:cNvGraphicFramePr>
                     <a:graphicFrameLocks noChangeAspect="1"/>
                   </wp:cNvGraphicFramePr>
@@ -5651,7 +5599,7 @@
                           <pic:cNvPicPr/>
                         </pic:nvPicPr>
                         <pic:blipFill>
-                          <a:blip r:embed="rId25"/>
+                          <a:blip r:embed="rId24"/>
                           <a:stretch>
                             <a:fillRect/>
                           </a:stretch>
@@ -5751,7 +5699,7 @@
               <w:drawing>
                 <wp:inline xmlns:a="http://schemas.openxmlformats.org/drawingml/2006/main" xmlns:pic="http://schemas.openxmlformats.org/drawingml/2006/picture">
                   <wp:extent cx="2951999" cy="1007616"/>
-                  <wp:docPr id="18" name="Picture 18"/>
+                  <wp:docPr id="17" name="Picture 17"/>
                   <wp:cNvGraphicFramePr>
                     <a:graphicFrameLocks noChangeAspect="1"/>
                   </wp:cNvGraphicFramePr>
@@ -5763,7 +5711,7 @@
                           <pic:cNvPicPr/>
                         </pic:nvPicPr>
                         <pic:blipFill>
-                          <a:blip r:embed="rId26"/>
+                          <a:blip r:embed="rId25"/>
                           <a:stretch>
                             <a:fillRect/>
                           </a:stretch>
@@ -5820,7 +5768,7 @@
               <w:drawing>
                 <wp:inline xmlns:a="http://schemas.openxmlformats.org/drawingml/2006/main" xmlns:pic="http://schemas.openxmlformats.org/drawingml/2006/picture">
                   <wp:extent cx="2951999" cy="1718063"/>
-                  <wp:docPr id="19" name="Picture 19"/>
+                  <wp:docPr id="18" name="Picture 18"/>
                   <wp:cNvGraphicFramePr>
                     <a:graphicFrameLocks noChangeAspect="1"/>
                   </wp:cNvGraphicFramePr>
@@ -5832,7 +5780,7 @@
                           <pic:cNvPicPr/>
                         </pic:nvPicPr>
                         <pic:blipFill>
-                          <a:blip r:embed="rId27"/>
+                          <a:blip r:embed="rId26"/>
                           <a:stretch>
                             <a:fillRect/>
                           </a:stretch>
@@ -5915,7 +5863,7 @@
               <w:drawing>
                 <wp:inline xmlns:a="http://schemas.openxmlformats.org/drawingml/2006/main" xmlns:pic="http://schemas.openxmlformats.org/drawingml/2006/picture">
                   <wp:extent cx="2951999" cy="793104"/>
-                  <wp:docPr id="20" name="Picture 20"/>
+                  <wp:docPr id="19" name="Picture 19"/>
                   <wp:cNvGraphicFramePr>
                     <a:graphicFrameLocks noChangeAspect="1"/>
                   </wp:cNvGraphicFramePr>
@@ -5927,7 +5875,7 @@
                           <pic:cNvPicPr/>
                         </pic:nvPicPr>
                         <pic:blipFill>
-                          <a:blip r:embed="rId28"/>
+                          <a:blip r:embed="rId27"/>
                           <a:stretch>
                             <a:fillRect/>
                           </a:stretch>
@@ -5984,7 +5932,7 @@
               <w:drawing>
                 <wp:inline xmlns:a="http://schemas.openxmlformats.org/drawingml/2006/main" xmlns:pic="http://schemas.openxmlformats.org/drawingml/2006/picture">
                   <wp:extent cx="2951999" cy="1029264"/>
-                  <wp:docPr id="21" name="Picture 21"/>
+                  <wp:docPr id="20" name="Picture 20"/>
                   <wp:cNvGraphicFramePr>
                     <a:graphicFrameLocks noChangeAspect="1"/>
                   </wp:cNvGraphicFramePr>
@@ -5996,7 +5944,7 @@
                           <pic:cNvPicPr/>
                         </pic:nvPicPr>
                         <pic:blipFill>
-                          <a:blip r:embed="rId29"/>
+                          <a:blip r:embed="rId28"/>
                           <a:stretch>
                             <a:fillRect/>
                           </a:stretch>
@@ -6138,7 +6086,7 @@
               <w:drawing>
                 <wp:inline xmlns:a="http://schemas.openxmlformats.org/drawingml/2006/main" xmlns:pic="http://schemas.openxmlformats.org/drawingml/2006/picture">
                   <wp:extent cx="3405063" cy="2749021"/>
-                  <wp:docPr id="22" name="Picture 22"/>
+                  <wp:docPr id="21" name="Picture 21"/>
                   <wp:cNvGraphicFramePr>
                     <a:graphicFrameLocks noChangeAspect="1"/>
                   </wp:cNvGraphicFramePr>
@@ -6150,7 +6098,7 @@
                           <pic:cNvPicPr/>
                         </pic:nvPicPr>
                         <pic:blipFill>
-                          <a:blip r:embed="rId30"/>
+                          <a:blip r:embed="rId29"/>
                           <a:stretch>
                             <a:fillRect/>
                           </a:stretch>
@@ -6207,7 +6155,7 @@
               <w:drawing>
                 <wp:inline xmlns:a="http://schemas.openxmlformats.org/drawingml/2006/main" xmlns:pic="http://schemas.openxmlformats.org/drawingml/2006/picture">
                   <wp:extent cx="2498935" cy="817985"/>
-                  <wp:docPr id="23" name="Picture 23"/>
+                  <wp:docPr id="22" name="Picture 22"/>
                   <wp:cNvGraphicFramePr>
                     <a:graphicFrameLocks noChangeAspect="1"/>
                   </wp:cNvGraphicFramePr>
@@ -6219,7 +6167,7 @@
                           <pic:cNvPicPr/>
                         </pic:nvPicPr>
                         <pic:blipFill>
-                          <a:blip r:embed="rId31"/>
+                          <a:blip r:embed="rId30"/>
                           <a:stretch>
                             <a:fillRect/>
                           </a:stretch>
@@ -6291,7 +6239,7 @@
         <w:drawing>
           <wp:inline xmlns:a="http://schemas.openxmlformats.org/drawingml/2006/main" xmlns:pic="http://schemas.openxmlformats.org/drawingml/2006/picture">
             <wp:extent cx="5324399" cy="4192077"/>
-            <wp:docPr id="24" name="Picture 24"/>
+            <wp:docPr id="23" name="Picture 23"/>
             <wp:cNvGraphicFramePr>
               <a:graphicFrameLocks noChangeAspect="1"/>
             </wp:cNvGraphicFramePr>
@@ -6303,7 +6251,7 @@
                     <pic:cNvPicPr/>
                   </pic:nvPicPr>
                   <pic:blipFill>
-                    <a:blip r:embed="rId32"/>
+                    <a:blip r:embed="rId31"/>
                     <a:stretch>
                       <a:fillRect/>
                     </a:stretch>
@@ -6420,7 +6368,7 @@
         <w:drawing>
           <wp:inline xmlns:a="http://schemas.openxmlformats.org/drawingml/2006/main" xmlns:pic="http://schemas.openxmlformats.org/drawingml/2006/picture">
             <wp:extent cx="6263999" cy="1148400"/>
-            <wp:docPr id="25" name="Picture 25"/>
+            <wp:docPr id="24" name="Picture 24"/>
             <wp:cNvGraphicFramePr>
               <a:graphicFrameLocks noChangeAspect="1"/>
             </wp:cNvGraphicFramePr>
@@ -6432,7 +6380,7 @@
                     <pic:cNvPicPr/>
                   </pic:nvPicPr>
                   <pic:blipFill>
-                    <a:blip r:embed="rId33"/>
+                    <a:blip r:embed="rId32"/>
                     <a:stretch>
                       <a:fillRect/>
                     </a:stretch>
@@ -6562,7 +6510,7 @@
               <w:drawing>
                 <wp:inline xmlns:a="http://schemas.openxmlformats.org/drawingml/2006/main" xmlns:pic="http://schemas.openxmlformats.org/drawingml/2006/picture">
                   <wp:extent cx="2951999" cy="2208095"/>
-                  <wp:docPr id="26" name="Picture 26"/>
+                  <wp:docPr id="25" name="Picture 25"/>
                   <wp:cNvGraphicFramePr>
                     <a:graphicFrameLocks noChangeAspect="1"/>
                   </wp:cNvGraphicFramePr>
@@ -6574,7 +6522,7 @@
                           <pic:cNvPicPr/>
                         </pic:nvPicPr>
                         <pic:blipFill>
-                          <a:blip r:embed="rId34"/>
+                          <a:blip r:embed="rId33"/>
                           <a:stretch>
                             <a:fillRect/>
                           </a:stretch>
@@ -6631,7 +6579,7 @@
               <w:drawing>
                 <wp:inline xmlns:a="http://schemas.openxmlformats.org/drawingml/2006/main" xmlns:pic="http://schemas.openxmlformats.org/drawingml/2006/picture">
                   <wp:extent cx="2951999" cy="2519039"/>
-                  <wp:docPr id="27" name="Picture 27"/>
+                  <wp:docPr id="26" name="Picture 26"/>
                   <wp:cNvGraphicFramePr>
                     <a:graphicFrameLocks noChangeAspect="1"/>
                   </wp:cNvGraphicFramePr>
@@ -6643,7 +6591,7 @@
                           <pic:cNvPicPr/>
                         </pic:nvPicPr>
                         <pic:blipFill>
-                          <a:blip r:embed="rId35"/>
+                          <a:blip r:embed="rId34"/>
                           <a:stretch>
                             <a:fillRect/>
                           </a:stretch>
@@ -6764,7 +6712,7 @@
         <w:drawing>
           <wp:inline xmlns:a="http://schemas.openxmlformats.org/drawingml/2006/main" xmlns:pic="http://schemas.openxmlformats.org/drawingml/2006/picture">
             <wp:extent cx="5324399" cy="4298565"/>
-            <wp:docPr id="28" name="Picture 28"/>
+            <wp:docPr id="27" name="Picture 27"/>
             <wp:cNvGraphicFramePr>
               <a:graphicFrameLocks noChangeAspect="1"/>
             </wp:cNvGraphicFramePr>
@@ -6776,7 +6724,7 @@
                     <pic:cNvPicPr/>
                   </pic:nvPicPr>
                   <pic:blipFill>
-                    <a:blip r:embed="rId36"/>
+                    <a:blip r:embed="rId35"/>
                     <a:stretch>
                       <a:fillRect/>
                     </a:stretch>
@@ -6897,7 +6845,7 @@
               <w:drawing>
                 <wp:inline xmlns:a="http://schemas.openxmlformats.org/drawingml/2006/main" xmlns:pic="http://schemas.openxmlformats.org/drawingml/2006/picture">
                   <wp:extent cx="3405063" cy="2231451"/>
-                  <wp:docPr id="29" name="Picture 29"/>
+                  <wp:docPr id="28" name="Picture 28"/>
                   <wp:cNvGraphicFramePr>
                     <a:graphicFrameLocks noChangeAspect="1"/>
                   </wp:cNvGraphicFramePr>
@@ -6909,7 +6857,7 @@
                           <pic:cNvPicPr/>
                         </pic:nvPicPr>
                         <pic:blipFill>
-                          <a:blip r:embed="rId37"/>
+                          <a:blip r:embed="rId36"/>
                           <a:stretch>
                             <a:fillRect/>
                           </a:stretch>
@@ -6966,7 +6914,7 @@
               <w:drawing>
                 <wp:inline xmlns:a="http://schemas.openxmlformats.org/drawingml/2006/main" xmlns:pic="http://schemas.openxmlformats.org/drawingml/2006/picture">
                   <wp:extent cx="2498935" cy="1700888"/>
-                  <wp:docPr id="30" name="Picture 30"/>
+                  <wp:docPr id="29" name="Picture 29"/>
                   <wp:cNvGraphicFramePr>
                     <a:graphicFrameLocks noChangeAspect="1"/>
                   </wp:cNvGraphicFramePr>
@@ -6978,7 +6926,7 @@
                           <pic:cNvPicPr/>
                         </pic:nvPicPr>
                         <pic:blipFill>
-                          <a:blip r:embed="rId38"/>
+                          <a:blip r:embed="rId37"/>
                           <a:stretch>
                             <a:fillRect/>
                           </a:stretch>
@@ -7105,7 +7053,7 @@
               <w:drawing>
                 <wp:inline xmlns:a="http://schemas.openxmlformats.org/drawingml/2006/main" xmlns:pic="http://schemas.openxmlformats.org/drawingml/2006/picture">
                   <wp:extent cx="2951999" cy="2638074"/>
-                  <wp:docPr id="31" name="Picture 31"/>
+                  <wp:docPr id="30" name="Picture 30"/>
                   <wp:cNvGraphicFramePr>
                     <a:graphicFrameLocks noChangeAspect="1"/>
                   </wp:cNvGraphicFramePr>
@@ -7117,7 +7065,7 @@
                           <pic:cNvPicPr/>
                         </pic:nvPicPr>
                         <pic:blipFill>
-                          <a:blip r:embed="rId39"/>
+                          <a:blip r:embed="rId38"/>
                           <a:stretch>
                             <a:fillRect/>
                           </a:stretch>
@@ -7174,7 +7122,7 @@
               <w:drawing>
                 <wp:inline xmlns:a="http://schemas.openxmlformats.org/drawingml/2006/main" xmlns:pic="http://schemas.openxmlformats.org/drawingml/2006/picture">
                   <wp:extent cx="2951999" cy="2859023"/>
-                  <wp:docPr id="32" name="Picture 32"/>
+                  <wp:docPr id="31" name="Picture 31"/>
                   <wp:cNvGraphicFramePr>
                     <a:graphicFrameLocks noChangeAspect="1"/>
                   </wp:cNvGraphicFramePr>
@@ -7186,7 +7134,7 @@
                           <pic:cNvPicPr/>
                         </pic:nvPicPr>
                         <pic:blipFill>
-                          <a:blip r:embed="rId40"/>
+                          <a:blip r:embed="rId39"/>
                           <a:stretch>
                             <a:fillRect/>
                           </a:stretch>
@@ -7296,7 +7244,7 @@
               <w:drawing>
                 <wp:inline xmlns:a="http://schemas.openxmlformats.org/drawingml/2006/main" xmlns:pic="http://schemas.openxmlformats.org/drawingml/2006/picture">
                   <wp:extent cx="2343599" cy="5071789"/>
-                  <wp:docPr id="33" name="Picture 33"/>
+                  <wp:docPr id="32" name="Picture 32"/>
                   <wp:cNvGraphicFramePr>
                     <a:graphicFrameLocks noChangeAspect="1"/>
                   </wp:cNvGraphicFramePr>
@@ -7308,7 +7256,7 @@
                           <pic:cNvPicPr/>
                         </pic:nvPicPr>
                         <pic:blipFill>
-                          <a:blip r:embed="rId41"/>
+                          <a:blip r:embed="rId40"/>
                           <a:stretch>
                             <a:fillRect/>
                           </a:stretch>
@@ -7347,7 +7295,7 @@
               <w:drawing>
                 <wp:inline xmlns:a="http://schemas.openxmlformats.org/drawingml/2006/main" xmlns:pic="http://schemas.openxmlformats.org/drawingml/2006/picture">
                   <wp:extent cx="2343599" cy="5071789"/>
-                  <wp:docPr id="34" name="Picture 34"/>
+                  <wp:docPr id="33" name="Picture 33"/>
                   <wp:cNvGraphicFramePr>
                     <a:graphicFrameLocks noChangeAspect="1"/>
                   </wp:cNvGraphicFramePr>
@@ -7359,7 +7307,7 @@
                           <pic:cNvPicPr/>
                         </pic:nvPicPr>
                         <pic:blipFill>
-                          <a:blip r:embed="rId42"/>
+                          <a:blip r:embed="rId41"/>
                           <a:stretch>
                             <a:fillRect/>
                           </a:stretch>
@@ -7517,7 +7465,7 @@
         <w:drawing>
           <wp:inline xmlns:a="http://schemas.openxmlformats.org/drawingml/2006/main" xmlns:pic="http://schemas.openxmlformats.org/drawingml/2006/picture">
             <wp:extent cx="6263999" cy="1833264"/>
-            <wp:docPr id="35" name="Picture 35"/>
+            <wp:docPr id="34" name="Picture 34"/>
             <wp:cNvGraphicFramePr>
               <a:graphicFrameLocks noChangeAspect="1"/>
             </wp:cNvGraphicFramePr>
@@ -7529,7 +7477,7 @@
                     <pic:cNvPicPr/>
                   </pic:nvPicPr>
                   <pic:blipFill>
-                    <a:blip r:embed="rId43"/>
+                    <a:blip r:embed="rId42"/>
                     <a:stretch>
                       <a:fillRect/>
                     </a:stretch>
@@ -7576,7 +7524,7 @@
         <w:drawing>
           <wp:inline xmlns:a="http://schemas.openxmlformats.org/drawingml/2006/main" xmlns:pic="http://schemas.openxmlformats.org/drawingml/2006/picture">
             <wp:extent cx="5324399" cy="2119111"/>
-            <wp:docPr id="36" name="Picture 36"/>
+            <wp:docPr id="35" name="Picture 35"/>
             <wp:cNvGraphicFramePr>
               <a:graphicFrameLocks noChangeAspect="1"/>
             </wp:cNvGraphicFramePr>
@@ -7588,7 +7536,7 @@
                     <pic:cNvPicPr/>
                   </pic:nvPicPr>
                   <pic:blipFill>
-                    <a:blip r:embed="rId44"/>
+                    <a:blip r:embed="rId43"/>
                     <a:stretch>
                       <a:fillRect/>
                     </a:stretch>
@@ -7708,7 +7656,7 @@
               <w:drawing>
                 <wp:inline xmlns:a="http://schemas.openxmlformats.org/drawingml/2006/main" xmlns:pic="http://schemas.openxmlformats.org/drawingml/2006/picture">
                   <wp:extent cx="2951999" cy="2383247"/>
-                  <wp:docPr id="37" name="Picture 37"/>
+                  <wp:docPr id="36" name="Picture 36"/>
                   <wp:cNvGraphicFramePr>
                     <a:graphicFrameLocks noChangeAspect="1"/>
                   </wp:cNvGraphicFramePr>
@@ -7720,7 +7668,7 @@
                           <pic:cNvPicPr/>
                         </pic:nvPicPr>
                         <pic:blipFill>
-                          <a:blip r:embed="rId45"/>
+                          <a:blip r:embed="rId44"/>
                           <a:stretch>
                             <a:fillRect/>
                           </a:stretch>
@@ -7777,7 +7725,7 @@
               <w:drawing>
                 <wp:inline xmlns:a="http://schemas.openxmlformats.org/drawingml/2006/main" xmlns:pic="http://schemas.openxmlformats.org/drawingml/2006/picture">
                   <wp:extent cx="2951999" cy="1964063"/>
-                  <wp:docPr id="38" name="Picture 38"/>
+                  <wp:docPr id="37" name="Picture 37"/>
                   <wp:cNvGraphicFramePr>
                     <a:graphicFrameLocks noChangeAspect="1"/>
                   </wp:cNvGraphicFramePr>
@@ -7789,7 +7737,7 @@
                           <pic:cNvPicPr/>
                         </pic:nvPicPr>
                         <pic:blipFill>
-                          <a:blip r:embed="rId46"/>
+                          <a:blip r:embed="rId45"/>
                           <a:stretch>
                             <a:fillRect/>
                           </a:stretch>
@@ -7864,7 +7812,7 @@
     <w:p>
       <w:r>
         <w:rPr/>
-        <w:t>As the original proposal recommends, new topics, interest tags, matching weights and the profile-reminder interval are settings, not programming work. Each topic shows its activity over the last 30 days. When one passes a threshold (eight posts a month in the demo), it is flagged as ready for its own space with a moderator.</w:t>
+        <w:t>As the original proposal recommends, new topics, interest tags, matching weights and the profile-reminder interval are settings, not programming work. Each topic shows its activity over the last 30 days. When one passes a threshold (eight posts a month in the prototype), it is flagged as ready for its own space with a moderator.</w:t>
       </w:r>
     </w:p>
     <w:tbl>
@@ -7905,7 +7853,7 @@
               <w:drawing>
                 <wp:inline xmlns:a="http://schemas.openxmlformats.org/drawingml/2006/main" xmlns:pic="http://schemas.openxmlformats.org/drawingml/2006/picture">
                   <wp:extent cx="2951999" cy="1956191"/>
-                  <wp:docPr id="39" name="Picture 39"/>
+                  <wp:docPr id="38" name="Picture 38"/>
                   <wp:cNvGraphicFramePr>
                     <a:graphicFrameLocks noChangeAspect="1"/>
                   </wp:cNvGraphicFramePr>
@@ -7917,7 +7865,7 @@
                           <pic:cNvPicPr/>
                         </pic:nvPicPr>
                         <pic:blipFill>
-                          <a:blip r:embed="rId47"/>
+                          <a:blip r:embed="rId46"/>
                           <a:stretch>
                             <a:fillRect/>
                           </a:stretch>
@@ -7974,7 +7922,7 @@
               <w:drawing>
                 <wp:inline xmlns:a="http://schemas.openxmlformats.org/drawingml/2006/main" xmlns:pic="http://schemas.openxmlformats.org/drawingml/2006/picture">
                   <wp:extent cx="2951999" cy="1550783"/>
-                  <wp:docPr id="40" name="Picture 40"/>
+                  <wp:docPr id="39" name="Picture 39"/>
                   <wp:cNvGraphicFramePr>
                     <a:graphicFrameLocks noChangeAspect="1"/>
                   </wp:cNvGraphicFramePr>
@@ -7986,7 +7934,7 @@
                           <pic:cNvPicPr/>
                         </pic:nvPicPr>
                         <pic:blipFill>
-                          <a:blip r:embed="rId48"/>
+                          <a:blip r:embed="rId47"/>
                           <a:stretch>
                             <a:fillRect/>
                           </a:stretch>
@@ -8073,7 +8021,7 @@
         <w:drawing>
           <wp:inline xmlns:a="http://schemas.openxmlformats.org/drawingml/2006/main" xmlns:pic="http://schemas.openxmlformats.org/drawingml/2006/picture">
             <wp:extent cx="6263999" cy="2981664"/>
-            <wp:docPr id="41" name="Picture 41"/>
+            <wp:docPr id="40" name="Picture 40"/>
             <wp:cNvGraphicFramePr>
               <a:graphicFrameLocks noChangeAspect="1"/>
             </wp:cNvGraphicFramePr>
@@ -8085,7 +8033,7 @@
                     <pic:cNvPicPr/>
                   </pic:nvPicPr>
                   <pic:blipFill>
-                    <a:blip r:embed="rId49"/>
+                    <a:blip r:embed="rId48"/>
                     <a:stretch>
                       <a:fillRect/>
                     </a:stretch>
@@ -8669,7 +8617,7 @@
               <w:drawing>
                 <wp:inline xmlns:a="http://schemas.openxmlformats.org/drawingml/2006/main" xmlns:pic="http://schemas.openxmlformats.org/drawingml/2006/picture">
                   <wp:extent cx="2951999" cy="2521007"/>
-                  <wp:docPr id="42" name="Picture 42"/>
+                  <wp:docPr id="41" name="Picture 41"/>
                   <wp:cNvGraphicFramePr>
                     <a:graphicFrameLocks noChangeAspect="1"/>
                   </wp:cNvGraphicFramePr>
@@ -8681,7 +8629,7 @@
                           <pic:cNvPicPr/>
                         </pic:nvPicPr>
                         <pic:blipFill>
-                          <a:blip r:embed="rId50"/>
+                          <a:blip r:embed="rId49"/>
                           <a:stretch>
                             <a:fillRect/>
                           </a:stretch>
@@ -8738,7 +8686,7 @@
               <w:drawing>
                 <wp:inline xmlns:a="http://schemas.openxmlformats.org/drawingml/2006/main" xmlns:pic="http://schemas.openxmlformats.org/drawingml/2006/picture">
                   <wp:extent cx="2951999" cy="1094208"/>
-                  <wp:docPr id="43" name="Picture 43"/>
+                  <wp:docPr id="42" name="Picture 42"/>
                   <wp:cNvGraphicFramePr>
                     <a:graphicFrameLocks noChangeAspect="1"/>
                   </wp:cNvGraphicFramePr>
@@ -8750,7 +8698,7 @@
                           <pic:cNvPicPr/>
                         </pic:nvPicPr>
                         <pic:blipFill>
-                          <a:blip r:embed="rId51"/>
+                          <a:blip r:embed="rId50"/>
                           <a:stretch>
                             <a:fillRect/>
                           </a:stretch>
@@ -10222,7 +10170,7 @@
               <w:drawing>
                 <wp:inline xmlns:a="http://schemas.openxmlformats.org/drawingml/2006/main" xmlns:pic="http://schemas.openxmlformats.org/drawingml/2006/picture">
                   <wp:extent cx="3317039" cy="1598813"/>
-                  <wp:docPr id="44" name="Picture 44"/>
+                  <wp:docPr id="43" name="Picture 43"/>
                   <wp:cNvGraphicFramePr>
                     <a:graphicFrameLocks noChangeAspect="1"/>
                   </wp:cNvGraphicFramePr>
@@ -10234,7 +10182,7 @@
                           <pic:cNvPicPr/>
                         </pic:nvPicPr>
                         <pic:blipFill>
-                          <a:blip r:embed="rId52"/>
+                          <a:blip r:embed="rId51"/>
                           <a:stretch>
                             <a:fillRect/>
                           </a:stretch>
@@ -10379,7 +10327,7 @@
               <w:drawing>
                 <wp:inline xmlns:a="http://schemas.openxmlformats.org/drawingml/2006/main" xmlns:pic="http://schemas.openxmlformats.org/drawingml/2006/picture">
                   <wp:extent cx="2343599" cy="1735826"/>
-                  <wp:docPr id="45" name="Picture 45"/>
+                  <wp:docPr id="44" name="Picture 44"/>
                   <wp:cNvGraphicFramePr>
                     <a:graphicFrameLocks noChangeAspect="1"/>
                   </wp:cNvGraphicFramePr>
@@ -10391,7 +10339,7 @@
                           <pic:cNvPicPr/>
                         </pic:nvPicPr>
                         <pic:blipFill>
-                          <a:blip r:embed="rId53"/>
+                          <a:blip r:embed="rId52"/>
                           <a:stretch>
                             <a:fillRect/>
                           </a:stretch>
@@ -10425,7 +10373,7 @@
               <w:rPr>
                 <w:color w:val="737B8C"/>
               </w:rPr>
-              <w:t xml:space="preserve"> The pilot stack and data model, as shown in the demo’s Architecture page.</w:t>
+              <w:t xml:space="preserve"> The pilot stack and data model, from the prototype’s administration area.</w:t>
             </w:r>
           </w:p>
         </w:tc>
@@ -14462,7 +14410,7 @@
           <w:b w:val="0"/>
           <w:color w:val="0A1834"/>
         </w:rPr>
-        <w:t>Using the demo</w:t>
+        <w:t>Trying the online demo</w:t>
       </w:r>
     </w:p>
     <w:p>
@@ -14471,12 +14419,12 @@
           <w:color w:val="464E5E"/>
           <w:sz w:val="23"/>
         </w:rPr>
-        <w:t>The demo is three HTML files. Keep them in the same folder and open them in Chrome or Edge. No internet connection or installation is needed.</w:t>
+        <w:t>The demo opens in any modern browser, on a laptop or a phone, with nothing to install. It is meant for current faculty to try, so we can learn what they would want added before the pilot is built.</w:t>
       </w:r>
     </w:p>
     <w:tbl>
       <w:tblPr>
-        <w:tblW w:type="dxa" w:w="9864"/>
+        <w:tblW w:type="dxa" w:w="2564"/>
         <w:tblBorders>
           <w:top w:val="nil"/>
           <w:left w:val="nil"/>
@@ -14489,8 +14437,8 @@
         <w:tblLook w:firstColumn="1" w:firstRow="1" w:lastColumn="0" w:lastRow="0" w:noHBand="0" w:noVBand="1" w:val="04A0"/>
       </w:tblPr>
       <w:tblGrid>
-        <w:gridCol w:w="3353"/>
-        <w:gridCol w:w="6510"/>
+        <w:gridCol w:w="2564"/>
+        <w:gridCol w:w="4933"/>
       </w:tblGrid>
       <w:tr>
         <w:trPr>
@@ -14499,7 +14447,7 @@
         </w:trPr>
         <w:tc>
           <w:tcPr>
-            <w:tcW w:type="dxa" w:w="3354"/>
+            <w:tcW w:type="dxa" w:w="2565"/>
             <w:tcBorders>
               <w:top w:val="nil"/>
               <w:left w:val="nil"/>
@@ -14524,13 +14472,50 @@
                 <w:color w:val="FFFFFF"/>
                 <w:sz w:val="17"/>
               </w:rPr>
-              <w:t>File</w:t>
+              <w:t>Link</w:t>
             </w:r>
           </w:p>
         </w:tc>
         <w:tc>
           <w:tcPr>
-            <w:tcW w:type="dxa" w:w="6511"/>
+            <w:tcW w:type="dxa" w:w="4933"/>
+            <w:tcBorders>
+              <w:top w:val="nil"/>
+              <w:left w:val="nil"/>
+              <w:bottom w:val="single" w:sz="4" w:color="DDE1E8"/>
+              <w:right w:val="nil"/>
+            </w:tcBorders>
+            <w:shd w:val="clear" w:color="auto" w:fill="F7F8FA"/>
+            <w:tcMar>
+              <w:top w:w="70" w:type="dxa"/>
+              <w:start w:w="100" w:type="dxa"/>
+              <w:bottom w:w="70" w:type="dxa"/>
+              <w:end w:w="100" w:type="dxa"/>
+            </w:tcMar>
+          </w:tcPr>
+          <w:p>
+            <w:pPr>
+              <w:spacing w:after="0"/>
+            </w:pPr>
+            <w:r>
+              <w:rPr>
+                <w:b/>
+                <w:color w:val="0A1834"/>
+                <w:sz w:val="18"/>
+              </w:rPr>
+              <w:t>claude.ai/artifact/HKcpCfBua9uHhv5Y3hNKNc</w:t>
+            </w:r>
+          </w:p>
+        </w:tc>
+      </w:tr>
+      <w:tr>
+        <w:trPr>
+          <w:cantSplit/>
+          <w:tblHeader/>
+        </w:trPr>
+        <w:tc>
+          <w:tcPr>
+            <w:tcW w:type="dxa" w:w="2565"/>
             <w:tcBorders>
               <w:top w:val="nil"/>
               <w:left w:val="nil"/>
@@ -14555,18 +14540,13 @@
                 <w:color w:val="FFFFFF"/>
                 <w:sz w:val="17"/>
               </w:rPr>
-              <w:t>What it shows</w:t>
+              <w:t>Password</w:t>
             </w:r>
           </w:p>
         </w:tc>
-      </w:tr>
-      <w:tr>
-        <w:trPr>
-          <w:cantSplit/>
-        </w:trPr>
         <w:tc>
           <w:tcPr>
-            <w:tcW w:type="dxa" w:w="3354"/>
+            <w:tcW w:type="dxa" w:w="4933"/>
             <w:tcBorders>
               <w:top w:val="nil"/>
               <w:left w:val="nil"/>
@@ -14586,23 +14566,28 @@
             </w:pPr>
             <w:r>
               <w:rPr>
-                <w:b/>
-                <w:color w:val="0A1834"/>
                 <w:sz w:val="18"/>
               </w:rPr>
-              <w:t>compare.html</w:t>
+              <w:t>Provided separately by the author</w:t>
             </w:r>
           </w:p>
         </w:tc>
+      </w:tr>
+      <w:tr>
+        <w:trPr>
+          <w:cantSplit/>
+          <w:tblHeader/>
+        </w:trPr>
         <w:tc>
           <w:tcPr>
-            <w:tcW w:type="dxa" w:w="6511"/>
+            <w:tcW w:type="dxa" w:w="2565"/>
             <w:tcBorders>
               <w:top w:val="nil"/>
               <w:left w:val="nil"/>
               <w:bottom w:val="single" w:sz="4" w:color="DDE1E8"/>
               <w:right w:val="nil"/>
             </w:tcBorders>
+            <w:shd w:val="clear" w:color="auto" w:fill="1D3C73"/>
             <w:tcMar>
               <w:top w:w="70" w:type="dxa"/>
               <w:start w:w="100" w:type="dxa"/>
@@ -14616,20 +14601,17 @@
             </w:pPr>
             <w:r>
               <w:rPr>
-                <w:sz w:val="18"/>
+                <w:b/>
+                <w:color w:val="FFFFFF"/>
+                <w:sz w:val="17"/>
               </w:rPr>
-              <w:t>The original proposal and the refined version side by side, with an 11-step guided tour (Next / Back, or the arrow keys). Best for a first look.</w:t>
+              <w:t>Time needed</w:t>
             </w:r>
           </w:p>
         </w:tc>
-      </w:tr>
-      <w:tr>
-        <w:trPr>
-          <w:cantSplit/>
-        </w:trPr>
         <w:tc>
           <w:tcPr>
-            <w:tcW w:type="dxa" w:w="3354"/>
+            <w:tcW w:type="dxa" w:w="4933"/>
             <w:tcBorders>
               <w:top w:val="nil"/>
               <w:left w:val="nil"/>
@@ -14650,24 +14632,28 @@
             </w:pPr>
             <w:r>
               <w:rPr>
-                <w:b/>
-                <w:color w:val="0A1834"/>
                 <w:sz w:val="18"/>
               </w:rPr>
-              <w:t>with-suggested-changes.html</w:t>
+              <w:t>About ten minutes</w:t>
             </w:r>
           </w:p>
         </w:tc>
+      </w:tr>
+      <w:tr>
+        <w:trPr>
+          <w:cantSplit/>
+          <w:tblHeader/>
+        </w:trPr>
         <w:tc>
           <w:tcPr>
-            <w:tcW w:type="dxa" w:w="6511"/>
+            <w:tcW w:type="dxa" w:w="2565"/>
             <w:tcBorders>
               <w:top w:val="nil"/>
               <w:left w:val="nil"/>
               <w:bottom w:val="single" w:sz="4" w:color="DDE1E8"/>
               <w:right w:val="nil"/>
             </w:tcBorders>
-            <w:shd w:val="clear" w:color="auto" w:fill="F7F8FA"/>
+            <w:shd w:val="clear" w:color="auto" w:fill="1D3C73"/>
             <w:tcMar>
               <w:top w:w="70" w:type="dxa"/>
               <w:start w:w="100" w:type="dxa"/>
@@ -14681,48 +14667,17 @@
             </w:pPr>
             <w:r>
               <w:rPr>
-                <w:sz w:val="18"/>
+                <w:b/>
+                <w:color w:val="FFFFFF"/>
+                <w:sz w:val="17"/>
               </w:rPr>
-              <w:t xml:space="preserve">The refined platform described in this document. Switch between Sofia, James, Erik and Linh in the top bar; </w:t>
-            </w:r>
-            <w:r>
-              <w:rPr>
-                <w:b/>
-                <w:color w:val="0A1834"/>
-                <w:sz w:val="18"/>
-              </w:rPr>
-              <w:t>What changed?</w:t>
-            </w:r>
-            <w:r>
-              <w:rPr>
-                <w:sz w:val="18"/>
-              </w:rPr>
-              <w:t xml:space="preserve"> lists the eight refinements; </w:t>
-            </w:r>
-            <w:r>
-              <w:rPr>
-                <w:b/>
-                <w:color w:val="0A1834"/>
-                <w:sz w:val="18"/>
-              </w:rPr>
-              <w:t>Present</w:t>
-            </w:r>
-            <w:r>
-              <w:rPr>
-                <w:sz w:val="18"/>
-              </w:rPr>
-              <w:t xml:space="preserve"> runs the tour.</w:t>
+              <w:t>Feedback</w:t>
             </w:r>
           </w:p>
         </w:tc>
-      </w:tr>
-      <w:tr>
-        <w:trPr>
-          <w:cantSplit/>
-        </w:trPr>
         <w:tc>
           <w:tcPr>
-            <w:tcW w:type="dxa" w:w="3354"/>
+            <w:tcW w:type="dxa" w:w="4933"/>
             <w:tcBorders>
               <w:top w:val="nil"/>
               <w:left w:val="nil"/>
@@ -14742,39 +14697,23 @@
             </w:pPr>
             <w:r>
               <w:rPr>
+                <w:sz w:val="18"/>
+              </w:rPr>
+              <w:t xml:space="preserve">The </w:t>
+            </w:r>
+            <w:r>
+              <w:rPr>
                 <w:b/>
                 <w:color w:val="0A1834"/>
                 <w:sz w:val="18"/>
               </w:rPr>
-              <w:t>proposal-as-written.html</w:t>
-            </w:r>
-          </w:p>
-        </w:tc>
-        <w:tc>
-          <w:tcPr>
-            <w:tcW w:type="dxa" w:w="6511"/>
-            <w:tcBorders>
-              <w:top w:val="nil"/>
-              <w:left w:val="nil"/>
-              <w:bottom w:val="single" w:sz="4" w:color="DDE1E8"/>
-              <w:right w:val="nil"/>
-            </w:tcBorders>
-            <w:tcMar>
-              <w:top w:w="70" w:type="dxa"/>
-              <w:start w:w="100" w:type="dxa"/>
-              <w:bottom w:w="70" w:type="dxa"/>
-              <w:end w:w="100" w:type="dxa"/>
-            </w:tcMar>
-          </w:tcPr>
-          <w:p>
-            <w:pPr>
-              <w:spacing w:after="0"/>
-            </w:pPr>
+              <w:t>Give feedback</w:t>
+            </w:r>
             <w:r>
               <w:rPr>
                 <w:sz w:val="18"/>
               </w:rPr>
-              <w:t>The original proposal, built as written, with labels pointing back to its sections.</w:t>
+              <w:t xml:space="preserve"> button on every screen opens the feedback form</w:t>
             </w:r>
           </w:p>
         </w:tc>
@@ -14787,63 +14726,501 @@
     </w:p>
     <w:p>
       <w:pPr>
-        <w:keepNext/>
-        <w:spacing w:after="60"/>
-        <w:jc w:val="center"/>
-      </w:pPr>
-      <w:r>
-        <w:drawing>
-          <wp:inline xmlns:a="http://schemas.openxmlformats.org/drawingml/2006/main" xmlns:pic="http://schemas.openxmlformats.org/drawingml/2006/picture">
-            <wp:extent cx="4071599" cy="2608538"/>
-            <wp:docPr id="46" name="Picture 46"/>
-            <wp:cNvGraphicFramePr>
-              <a:graphicFrameLocks noChangeAspect="1"/>
-            </wp:cNvGraphicFramePr>
-            <a:graphic>
-              <a:graphicData uri="http://schemas.openxmlformats.org/drawingml/2006/picture">
-                <pic:pic>
-                  <pic:nvPicPr>
-                    <pic:cNvPr id="0" name="compare.jpg"/>
-                    <pic:cNvPicPr/>
-                  </pic:nvPicPr>
-                  <pic:blipFill>
-                    <a:blip r:embed="rId54"/>
-                    <a:stretch>
-                      <a:fillRect/>
-                    </a:stretch>
-                  </pic:blipFill>
-                  <pic:spPr>
-                    <a:xfrm>
-                      <a:off x="0" y="0"/>
-                      <a:ext cx="4071599" cy="2608538"/>
-                    </a:xfrm>
-                    <a:prstGeom prst="rect"/>
-                  </pic:spPr>
-                </pic:pic>
-              </a:graphicData>
-            </a:graphic>
-          </wp:inline>
-        </w:drawing>
-      </w:r>
-    </w:p>
-    <w:p>
-      <w:pPr>
-        <w:pStyle w:val="Caption"/>
-        <w:jc w:val="center"/>
+        <w:pStyle w:val="Heading2"/>
       </w:pPr>
       <w:r>
         <w:rPr>
-          <w:b/>
-          <w:color w:val="737B8C"/>
+          <w:b w:val="0"/>
+          <w:color w:val="0A1834"/>
         </w:rPr>
-        <w:t>Figure.</w:t>
+        <w:t>Two ways in</w:t>
       </w:r>
-      <w:r>
-        <w:rPr>
-          <w:color w:val="737B8C"/>
-        </w:rPr>
-        <w:t xml:space="preserve"> The side-by-side view at step 3: on the left, the partner is blocked at sign-in; on the right, the same partner has guest access.</w:t>
-      </w:r>
+    </w:p>
+    <w:tbl>
+      <w:tblPr>
+        <w:tblW w:type="dxa" w:w="9581"/>
+        <w:tblBorders>
+          <w:top w:val="nil"/>
+          <w:left w:val="nil"/>
+          <w:bottom w:val="nil"/>
+          <w:right w:val="nil"/>
+          <w:insideH w:val="nil"/>
+          <w:insideV w:val="nil"/>
+        </w:tblBorders>
+        <w:tblLayout w:type="fixed"/>
+        <w:tblLook w:firstColumn="1" w:firstRow="1" w:lastColumn="0" w:lastRow="0" w:noHBand="0" w:noVBand="1" w:val="04A0"/>
+      </w:tblPr>
+      <w:tblGrid>
+        <w:gridCol w:w="4790"/>
+        <w:gridCol w:w="4790"/>
+      </w:tblGrid>
+      <w:tr>
+        <w:tc>
+          <w:tcPr>
+            <w:tcW w:type="dxa" w:w="4791"/>
+            <w:tcMar>
+              <w:top w:w="0" w:type="dxa"/>
+              <w:start w:w="0" w:type="dxa"/>
+              <w:bottom w:w="0" w:type="dxa"/>
+              <w:end w:w="140" w:type="dxa"/>
+            </w:tcMar>
+          </w:tcPr>
+          <w:p>
+            <w:pPr>
+              <w:keepNext/>
+              <w:spacing w:before="120" w:after="40"/>
+            </w:pPr>
+            <w:r>
+              <w:rPr>
+                <w:b/>
+                <w:color w:val="C72027"/>
+                <w:sz w:val="17"/>
+              </w:rPr>
+              <w:t>“I’M NEW TO VINUNI”</w:t>
+            </w:r>
+          </w:p>
+          <w:p>
+            <w:r>
+              <w:rPr/>
+              <w:t>A four-step onboarding: name and college; title, expertise, home country and languages; arrival date, family and where they will live (optional); and what they would like help with. The dashboard is then built from those answers, with an arrival checklist, buddy suggestions, guides on their topics and upcoming events.</w:t>
+            </w:r>
+          </w:p>
+        </w:tc>
+        <w:tc>
+          <w:tcPr>
+            <w:tcW w:type="dxa" w:w="4791"/>
+            <w:tcMar>
+              <w:top w:w="0" w:type="dxa"/>
+              <w:start w:w="140" w:type="dxa"/>
+              <w:bottom w:w="0" w:type="dxa"/>
+              <w:end w:w="0" w:type="dxa"/>
+            </w:tcMar>
+          </w:tcPr>
+          <w:p>
+            <w:pPr>
+              <w:keepNext/>
+              <w:spacing w:before="120" w:after="40"/>
+            </w:pPr>
+            <w:r>
+              <w:rPr>
+                <w:b/>
+                <w:color w:val="C72027"/>
+                <w:sz w:val="17"/>
+              </w:rPr>
+              <w:t>“I’VE BEEN HERE A WHILE”</w:t>
+            </w:r>
+          </w:p>
+          <w:p>
+            <w:r>
+              <w:rPr/>
+              <w:t>A demo sign-in that never asks for a password, straight into a sample account of a faculty member who has been here three years. It shows a buddy request from a newcomer to accept, a current buddy, questions in their areas and new colleagues to welcome.</w:t>
+            </w:r>
+          </w:p>
+        </w:tc>
+      </w:tr>
+    </w:tbl>
+    <w:p>
+      <w:pPr>
+        <w:spacing w:after="40"/>
+      </w:pPr>
+    </w:p>
+    <w:tbl>
+      <w:tblPr>
+        <w:tblW w:type="dxa" w:w="9297"/>
+        <w:tblBorders>
+          <w:top w:val="nil"/>
+          <w:left w:val="nil"/>
+          <w:bottom w:val="nil"/>
+          <w:right w:val="nil"/>
+          <w:insideH w:val="nil"/>
+          <w:insideV w:val="nil"/>
+        </w:tblBorders>
+        <w:tblLayout w:type="fixed"/>
+        <w:tblLook w:firstColumn="1" w:firstRow="1" w:lastColumn="0" w:lastRow="0" w:noHBand="0" w:noVBand="1" w:val="04A0"/>
+      </w:tblPr>
+      <w:tblGrid>
+        <w:gridCol w:w="3099"/>
+        <w:gridCol w:w="3099"/>
+        <w:gridCol w:w="3099"/>
+      </w:tblGrid>
+      <w:tr>
+        <w:tc>
+          <w:tcPr>
+            <w:tcW w:type="dxa" w:w="3099"/>
+            <w:tcMar>
+              <w:top w:w="0" w:type="dxa"/>
+              <w:start w:w="0" w:type="dxa"/>
+              <w:bottom w:w="0" w:type="dxa"/>
+              <w:end w:w="140" w:type="dxa"/>
+            </w:tcMar>
+          </w:tcPr>
+          <w:p>
+            <w:pPr>
+              <w:keepNext/>
+              <w:spacing w:after="60"/>
+            </w:pPr>
+            <w:r>
+              <w:drawing>
+                <wp:inline xmlns:a="http://schemas.openxmlformats.org/drawingml/2006/main" xmlns:pic="http://schemas.openxmlformats.org/drawingml/2006/picture">
+                  <wp:extent cx="1877999" cy="1185170"/>
+                  <wp:docPr id="45" name="Picture 45"/>
+                  <wp:cNvGraphicFramePr>
+                    <a:graphicFrameLocks noChangeAspect="1"/>
+                  </wp:cNvGraphicFramePr>
+                  <a:graphic>
+                    <a:graphicData uri="http://schemas.openxmlformats.org/drawingml/2006/picture">
+                      <pic:pic>
+                        <pic:nvPicPr>
+                          <pic:cNvPr id="0" name="t-landing.jpg"/>
+                          <pic:cNvPicPr/>
+                        </pic:nvPicPr>
+                        <pic:blipFill>
+                          <a:blip r:embed="rId53"/>
+                          <a:stretch>
+                            <a:fillRect/>
+                          </a:stretch>
+                        </pic:blipFill>
+                        <pic:spPr>
+                          <a:xfrm>
+                            <a:off x="0" y="0"/>
+                            <a:ext cx="1877999" cy="1185170"/>
+                          </a:xfrm>
+                          <a:prstGeom prst="rect"/>
+                        </pic:spPr>
+                      </pic:pic>
+                    </a:graphicData>
+                  </a:graphic>
+                </wp:inline>
+              </w:drawing>
+            </w:r>
+          </w:p>
+          <w:p>
+            <w:pPr>
+              <w:pStyle w:val="Caption"/>
+            </w:pPr>
+            <w:r>
+              <w:rPr>
+                <w:b/>
+                <w:color w:val="737B8C"/>
+              </w:rPr>
+              <w:t>Figure.</w:t>
+            </w:r>
+            <w:r>
+              <w:rPr>
+                <w:color w:val="737B8C"/>
+              </w:rPr>
+              <w:t xml:space="preserve"> The start screen: new, or here a while.</w:t>
+            </w:r>
+          </w:p>
+        </w:tc>
+        <w:tc>
+          <w:tcPr>
+            <w:tcW w:type="dxa" w:w="3099"/>
+            <w:tcMar>
+              <w:top w:w="0" w:type="dxa"/>
+              <w:start w:w="140" w:type="dxa"/>
+              <w:bottom w:w="0" w:type="dxa"/>
+              <w:end w:w="140" w:type="dxa"/>
+            </w:tcMar>
+          </w:tcPr>
+          <w:p>
+            <w:pPr>
+              <w:keepNext/>
+              <w:spacing w:after="60"/>
+            </w:pPr>
+            <w:r>
+              <w:drawing>
+                <wp:inline xmlns:a="http://schemas.openxmlformats.org/drawingml/2006/main" xmlns:pic="http://schemas.openxmlformats.org/drawingml/2006/picture">
+                  <wp:extent cx="1877999" cy="1722578"/>
+                  <wp:docPr id="46" name="Picture 46"/>
+                  <wp:cNvGraphicFramePr>
+                    <a:graphicFrameLocks noChangeAspect="1"/>
+                  </wp:cNvGraphicFramePr>
+                  <a:graphic>
+                    <a:graphicData uri="http://schemas.openxmlformats.org/drawingml/2006/picture">
+                      <pic:pic>
+                        <pic:nvPicPr>
+                          <pic:cNvPr id="0" name="t-onboard1.jpg"/>
+                          <pic:cNvPicPr/>
+                        </pic:nvPicPr>
+                        <pic:blipFill>
+                          <a:blip r:embed="rId54"/>
+                          <a:stretch>
+                            <a:fillRect/>
+                          </a:stretch>
+                        </pic:blipFill>
+                        <pic:spPr>
+                          <a:xfrm>
+                            <a:off x="0" y="0"/>
+                            <a:ext cx="1877999" cy="1722578"/>
+                          </a:xfrm>
+                          <a:prstGeom prst="rect"/>
+                        </pic:spPr>
+                      </pic:pic>
+                    </a:graphicData>
+                  </a:graphic>
+                </wp:inline>
+              </w:drawing>
+            </w:r>
+          </w:p>
+          <w:p>
+            <w:pPr>
+              <w:pStyle w:val="Caption"/>
+            </w:pPr>
+            <w:r>
+              <w:rPr>
+                <w:b/>
+                <w:color w:val="737B8C"/>
+              </w:rPr>
+              <w:t>Figure.</w:t>
+            </w:r>
+            <w:r>
+              <w:rPr>
+                <w:color w:val="737B8C"/>
+              </w:rPr>
+              <w:t xml:space="preserve"> Onboarding step 1: name and college.</w:t>
+            </w:r>
+          </w:p>
+        </w:tc>
+        <w:tc>
+          <w:tcPr>
+            <w:tcW w:type="dxa" w:w="3099"/>
+            <w:tcMar>
+              <w:top w:w="0" w:type="dxa"/>
+              <w:start w:w="140" w:type="dxa"/>
+              <w:bottom w:w="0" w:type="dxa"/>
+              <w:end w:w="0" w:type="dxa"/>
+            </w:tcMar>
+          </w:tcPr>
+          <w:p>
+            <w:pPr>
+              <w:keepNext/>
+              <w:spacing w:after="60"/>
+            </w:pPr>
+            <w:r>
+              <w:drawing>
+                <wp:inline xmlns:a="http://schemas.openxmlformats.org/drawingml/2006/main" xmlns:pic="http://schemas.openxmlformats.org/drawingml/2006/picture">
+                  <wp:extent cx="1877999" cy="2305406"/>
+                  <wp:docPr id="47" name="Picture 47"/>
+                  <wp:cNvGraphicFramePr>
+                    <a:graphicFrameLocks noChangeAspect="1"/>
+                  </wp:cNvGraphicFramePr>
+                  <a:graphic>
+                    <a:graphicData uri="http://schemas.openxmlformats.org/drawingml/2006/picture">
+                      <pic:pic>
+                        <pic:nvPicPr>
+                          <pic:cNvPr id="0" name="t-onboard3.jpg"/>
+                          <pic:cNvPicPr/>
+                        </pic:nvPicPr>
+                        <pic:blipFill>
+                          <a:blip r:embed="rId55"/>
+                          <a:stretch>
+                            <a:fillRect/>
+                          </a:stretch>
+                        </pic:blipFill>
+                        <pic:spPr>
+                          <a:xfrm>
+                            <a:off x="0" y="0"/>
+                            <a:ext cx="1877999" cy="2305406"/>
+                          </a:xfrm>
+                          <a:prstGeom prst="rect"/>
+                        </pic:spPr>
+                      </pic:pic>
+                    </a:graphicData>
+                  </a:graphic>
+                </wp:inline>
+              </w:drawing>
+            </w:r>
+          </w:p>
+          <w:p>
+            <w:pPr>
+              <w:pStyle w:val="Caption"/>
+            </w:pPr>
+            <w:r>
+              <w:rPr>
+                <w:b/>
+                <w:color w:val="737B8C"/>
+              </w:rPr>
+              <w:t>Figure.</w:t>
+            </w:r>
+            <w:r>
+              <w:rPr>
+                <w:color w:val="737B8C"/>
+              </w:rPr>
+              <w:t xml:space="preserve"> Onboarding step 3: the move. Family details are optional and private.</w:t>
+            </w:r>
+          </w:p>
+        </w:tc>
+      </w:tr>
+    </w:tbl>
+    <w:p>
+      <w:pPr>
+        <w:spacing w:after="40"/>
+      </w:pPr>
+    </w:p>
+    <w:tbl>
+      <w:tblPr>
+        <w:tblW w:type="dxa" w:w="9581"/>
+        <w:tblBorders>
+          <w:top w:val="nil"/>
+          <w:left w:val="nil"/>
+          <w:bottom w:val="nil"/>
+          <w:right w:val="nil"/>
+          <w:insideH w:val="nil"/>
+          <w:insideV w:val="nil"/>
+        </w:tblBorders>
+        <w:tblLayout w:type="fixed"/>
+        <w:tblLook w:firstColumn="1" w:firstRow="1" w:lastColumn="0" w:lastRow="0" w:noHBand="0" w:noVBand="1" w:val="04A0"/>
+      </w:tblPr>
+      <w:tblGrid>
+        <w:gridCol w:w="4790"/>
+        <w:gridCol w:w="4790"/>
+      </w:tblGrid>
+      <w:tr>
+        <w:tc>
+          <w:tcPr>
+            <w:tcW w:type="dxa" w:w="4791"/>
+            <w:tcMar>
+              <w:top w:w="0" w:type="dxa"/>
+              <w:start w:w="0" w:type="dxa"/>
+              <w:bottom w:w="0" w:type="dxa"/>
+              <w:end w:w="140" w:type="dxa"/>
+            </w:tcMar>
+          </w:tcPr>
+          <w:p>
+            <w:pPr>
+              <w:keepNext/>
+              <w:spacing w:after="60"/>
+            </w:pPr>
+            <w:r>
+              <w:drawing>
+                <wp:inline xmlns:a="http://schemas.openxmlformats.org/drawingml/2006/main" xmlns:pic="http://schemas.openxmlformats.org/drawingml/2006/picture">
+                  <wp:extent cx="2951999" cy="3194063"/>
+                  <wp:docPr id="48" name="Picture 48"/>
+                  <wp:cNvGraphicFramePr>
+                    <a:graphicFrameLocks noChangeAspect="1"/>
+                  </wp:cNvGraphicFramePr>
+                  <a:graphic>
+                    <a:graphicData uri="http://schemas.openxmlformats.org/drawingml/2006/picture">
+                      <pic:pic>
+                        <pic:nvPicPr>
+                          <pic:cNvPr id="0" name="t-newhome.jpg"/>
+                          <pic:cNvPicPr/>
+                        </pic:nvPicPr>
+                        <pic:blipFill>
+                          <a:blip r:embed="rId56"/>
+                          <a:stretch>
+                            <a:fillRect/>
+                          </a:stretch>
+                        </pic:blipFill>
+                        <pic:spPr>
+                          <a:xfrm>
+                            <a:off x="0" y="0"/>
+                            <a:ext cx="2951999" cy="3194063"/>
+                          </a:xfrm>
+                          <a:prstGeom prst="rect"/>
+                        </pic:spPr>
+                      </pic:pic>
+                    </a:graphicData>
+                  </a:graphic>
+                </wp:inline>
+              </w:drawing>
+            </w:r>
+          </w:p>
+          <w:p>
+            <w:pPr>
+              <w:pStyle w:val="Caption"/>
+            </w:pPr>
+            <w:r>
+              <w:rPr>
+                <w:b/>
+                <w:color w:val="737B8C"/>
+              </w:rPr>
+              <w:t>Figure.</w:t>
+            </w:r>
+            <w:r>
+              <w:rPr>
+                <w:color w:val="737B8C"/>
+              </w:rPr>
+              <w:t xml:space="preserve"> A new faculty member’s dashboard, built from their onboarding answers.</w:t>
+            </w:r>
+          </w:p>
+        </w:tc>
+        <w:tc>
+          <w:tcPr>
+            <w:tcW w:type="dxa" w:w="4791"/>
+            <w:tcMar>
+              <w:top w:w="0" w:type="dxa"/>
+              <w:start w:w="140" w:type="dxa"/>
+              <w:bottom w:w="0" w:type="dxa"/>
+              <w:end w:w="0" w:type="dxa"/>
+            </w:tcMar>
+          </w:tcPr>
+          <w:p>
+            <w:pPr>
+              <w:keepNext/>
+              <w:spacing w:after="60"/>
+            </w:pPr>
+            <w:r>
+              <w:drawing>
+                <wp:inline xmlns:a="http://schemas.openxmlformats.org/drawingml/2006/main" xmlns:pic="http://schemas.openxmlformats.org/drawingml/2006/picture">
+                  <wp:extent cx="2951999" cy="3251135"/>
+                  <wp:docPr id="49" name="Picture 49"/>
+                  <wp:cNvGraphicFramePr>
+                    <a:graphicFrameLocks noChangeAspect="1"/>
+                  </wp:cNvGraphicFramePr>
+                  <a:graphic>
+                    <a:graphicData uri="http://schemas.openxmlformats.org/drawingml/2006/picture">
+                      <pic:pic>
+                        <pic:nvPicPr>
+                          <pic:cNvPr id="0" name="t-esthome.jpg"/>
+                          <pic:cNvPicPr/>
+                        </pic:nvPicPr>
+                        <pic:blipFill>
+                          <a:blip r:embed="rId57"/>
+                          <a:stretch>
+                            <a:fillRect/>
+                          </a:stretch>
+                        </pic:blipFill>
+                        <pic:spPr>
+                          <a:xfrm>
+                            <a:off x="0" y="0"/>
+                            <a:ext cx="2951999" cy="3251135"/>
+                          </a:xfrm>
+                          <a:prstGeom prst="rect"/>
+                        </pic:spPr>
+                      </pic:pic>
+                    </a:graphicData>
+                  </a:graphic>
+                </wp:inline>
+              </w:drawing>
+            </w:r>
+          </w:p>
+          <w:p>
+            <w:pPr>
+              <w:pStyle w:val="Caption"/>
+            </w:pPr>
+            <w:r>
+              <w:rPr>
+                <w:b/>
+                <w:color w:val="737B8C"/>
+              </w:rPr>
+              <w:t>Figure.</w:t>
+            </w:r>
+            <w:r>
+              <w:rPr>
+                <w:color w:val="737B8C"/>
+              </w:rPr>
+              <w:t xml:space="preserve"> An established faculty member’s dashboard after the demo sign-in.</w:t>
+            </w:r>
+          </w:p>
+        </w:tc>
+      </w:tr>
+    </w:tbl>
+    <w:p>
+      <w:pPr>
+        <w:spacing w:after="40"/>
+      </w:pPr>
     </w:p>
     <w:p>
       <w:pPr>
@@ -14854,7 +15231,31 @@
           <w:b w:val="0"/>
           <w:color w:val="0A1834"/>
         </w:rPr>
-        <w:t>A five-minute walkthrough</w:t>
+        <w:t>Suggested things to try</w:t>
+      </w:r>
+    </w:p>
+    <w:p>
+      <w:pPr>
+        <w:pStyle w:val="ListNumber"/>
+        <w:numPr>
+          <w:ilvl w:val="0"/>
+          <w:numId w:val="13"/>
+        </w:numPr>
+      </w:pPr>
+      <w:r>
+        <w:rPr/>
+        <w:t xml:space="preserve">Choose </w:t>
+      </w:r>
+      <w:r>
+        <w:rPr>
+          <w:b/>
+          <w:color w:val="0A1834"/>
+        </w:rPr>
+        <w:t>I’m new to VinUni</w:t>
+      </w:r>
+      <w:r>
+        <w:rPr/>
+        <w:t>, complete the four steps, and look at the dashboard built for you.</w:t>
       </w:r>
     </w:p>
     <w:p>
@@ -14874,11 +15275,11 @@
           <w:b/>
           <w:color w:val="0A1834"/>
         </w:rPr>
-        <w:t>compare.html</w:t>
+        <w:t>My buddy</w:t>
       </w:r>
       <w:r>
         <w:rPr/>
-        <w:t xml:space="preserve"> and step through the tour.</w:t>
+        <w:t>, ask one of the suggested colleagues, then click the button to see what happens when they say yes.</w:t>
       </w:r>
     </w:p>
     <w:p>
@@ -14891,51 +15292,18 @@
       </w:pPr>
       <w:r>
         <w:rPr/>
-        <w:t xml:space="preserve">Open </w:t>
+        <w:t xml:space="preserve">Ask a question in </w:t>
       </w:r>
       <w:r>
         <w:rPr>
           <w:b/>
           <w:color w:val="0A1834"/>
         </w:rPr>
-        <w:t>with-suggested-changes.html</w:t>
+        <w:t>Ask &amp; Discuss</w:t>
       </w:r>
       <w:r>
         <w:rPr/>
-        <w:t xml:space="preserve"> and choose </w:t>
-      </w:r>
-      <w:r>
-        <w:rPr>
-          <w:b/>
-          <w:color w:val="0A1834"/>
-        </w:rPr>
-        <w:t>Sofia</w:t>
-      </w:r>
-      <w:r>
-        <w:rPr/>
-        <w:t xml:space="preserve">. Open </w:t>
-      </w:r>
-      <w:r>
-        <w:rPr>
-          <w:b/>
-          <w:color w:val="0A1834"/>
-        </w:rPr>
-        <w:t>My buddy</w:t>
-      </w:r>
-      <w:r>
-        <w:rPr/>
-        <w:t xml:space="preserve">, adjust what matters, and click </w:t>
-      </w:r>
-      <w:r>
-        <w:rPr>
-          <w:b/>
-          <w:color w:val="0A1834"/>
-        </w:rPr>
-        <w:t>I’d like …</w:t>
-      </w:r>
-      <w:r>
-        <w:rPr/>
-        <w:t xml:space="preserve"> on a suggestion.</w:t>
+        <w:t xml:space="preserve"> and see which colleagues it would be sent to.</w:t>
       </w:r>
     </w:p>
     <w:p>
@@ -14948,40 +15316,29 @@
       </w:pPr>
       <w:r>
         <w:rPr/>
-        <w:t xml:space="preserve">Switch to </w:t>
+        <w:t xml:space="preserve">Click </w:t>
       </w:r>
       <w:r>
         <w:rPr>
           <w:b/>
           <w:color w:val="0A1834"/>
         </w:rPr>
-        <w:t>Linh</w:t>
+        <w:t>Start over</w:t>
       </w:r>
       <w:r>
         <w:rPr/>
-        <w:t xml:space="preserve"> in the top bar. Under </w:t>
+        <w:t xml:space="preserve">, choose </w:t>
       </w:r>
       <w:r>
         <w:rPr>
           <w:b/>
           <w:color w:val="0A1834"/>
         </w:rPr>
-        <w:t>Matching</w:t>
+        <w:t>I’ve been here a while</w:t>
       </w:r>
       <w:r>
         <w:rPr/>
-        <w:t xml:space="preserve">, click </w:t>
-      </w:r>
-      <w:r>
-        <w:rPr>
-          <w:b/>
-          <w:color w:val="0A1834"/>
-        </w:rPr>
-        <w:t>Confirm</w:t>
-      </w:r>
-      <w:r>
-        <w:rPr/>
-        <w:t>.</w:t>
+        <w:t>, sign in, and accept the buddy request.</w:t>
       </w:r>
     </w:p>
     <w:p>
@@ -14994,53 +15351,18 @@
       </w:pPr>
       <w:r>
         <w:rPr/>
-        <w:t xml:space="preserve">Switch back to </w:t>
+        <w:t xml:space="preserve">Click </w:t>
       </w:r>
       <w:r>
         <w:rPr>
           <w:b/>
           <w:color w:val="0A1834"/>
         </w:rPr>
-        <w:t>Sofia</w:t>
+        <w:t>Give feedback</w:t>
       </w:r>
       <w:r>
         <w:rPr/>
-        <w:t xml:space="preserve"> to see the introduction, then click </w:t>
-      </w:r>
-      <w:r>
-        <w:rPr>
-          <w:b/>
-          <w:color w:val="0A1834"/>
-        </w:rPr>
-        <w:t>Demo: skip ahead 3 weeks</w:t>
-      </w:r>
-      <w:r>
-        <w:rPr/>
-        <w:t xml:space="preserve"> to answer the check-in.</w:t>
-      </w:r>
-    </w:p>
-    <w:p>
-      <w:pPr>
-        <w:pStyle w:val="ListNumber"/>
-        <w:numPr>
-          <w:ilvl w:val="0"/>
-          <w:numId w:val="13"/>
-        </w:numPr>
-      </w:pPr>
-      <w:r>
-        <w:rPr/>
-        <w:t xml:space="preserve">Switch to </w:t>
-      </w:r>
-      <w:r>
-        <w:rPr>
-          <w:b/>
-          <w:color w:val="0A1834"/>
-        </w:rPr>
-        <w:t>Erik</w:t>
-      </w:r>
-      <w:r>
-        <w:rPr/>
-        <w:t xml:space="preserve"> to see what a partner can and cannot access.</w:t>
+        <w:t xml:space="preserve"> and tell us what you would add, change or remove.</w:t>
       </w:r>
     </w:p>
     <w:p>
@@ -15049,7 +15371,7 @@
           <w:color w:val="737B8C"/>
           <w:sz w:val="17"/>
         </w:rPr>
-        <w:t xml:space="preserve">The demo keeps its changes in the browser. </w:t>
+        <w:t xml:space="preserve">What testers enter stays in their own browser and is not sent anywhere. </w:t>
       </w:r>
       <w:r>
         <w:rPr>
@@ -15057,14 +15379,14 @@
           <w:color w:val="737B8C"/>
           <w:sz w:val="17"/>
         </w:rPr>
-        <w:t>Reset</w:t>
+        <w:t>Start over</w:t>
       </w:r>
       <w:r>
         <w:rPr>
           <w:color w:val="737B8C"/>
           <w:sz w:val="17"/>
         </w:rPr>
-        <w:t xml:space="preserve"> in the top bar returns it to the starting state, and starting the tour also resets it. The demo runs on a fixed date (15 October 2026) so the sample story stays consistent.</w:t>
+        <w:t xml:space="preserve"> clears it. The partner and coordinator views described in this document are part of the prototype but not of the online demo.</w:t>
       </w:r>
     </w:p>
     <w:p>
@@ -15090,7 +15412,7 @@
     <w:p>
       <w:r>
         <w:rPr/>
-        <w:t>The original proposal (§14) lists ten acceptance criteria for a minimum viable product. All ten are met by the refined design and shown in the demo.</w:t>
+        <w:t>The original proposal (§14) lists ten acceptance criteria for a minimum viable product. All ten are met by the refined design and built into the prototype.</w:t>
       </w:r>
     </w:p>
     <w:tbl>
@@ -17388,7 +17710,7 @@
       </w:pPr>
     </w:p>
     <w:sectPr>
-      <w:footerReference w:type="default" r:id="rId55"/>
+      <w:footerReference w:type="default" r:id="rId58"/>
       <w:pgSz w:w="11906" w:h="16838"/>
       <w:pgMar w:top="1077" w:right="1020" w:bottom="1020" w:left="1020" w:header="720" w:footer="720" w:gutter="0"/>
       <w:cols w:space="720"/>

</xml_diff>

<commit_message>
Send demo feedback to the Microsoft Form shared with the link
Faculty receive the feedback form separately, so the demo's Give
feedback button now points them to it instead of saying it is coming
soon. The proposal's Appendix A says the same.

Co-Authored-By: Claude Opus 5.5 <noreply@anthropic.com>
Claude-Session: https://claude.ai/code/session_01Da9hsk65BwNStoX3Txt7MF
</commit_message>
<xml_diff>
--- a/demos/vinuni-faculty-community/International-Faculty-Community-Pilot-Proposal.docx
+++ b/demos/vinuni-faculty-community/International-Faculty-Community-Pilot-Proposal.docx
@@ -14699,7 +14699,7 @@
               <w:rPr>
                 <w:sz w:val="18"/>
               </w:rPr>
-              <w:t xml:space="preserve">The </w:t>
+              <w:t xml:space="preserve">Through the Microsoft Form shared together with the link. The </w:t>
             </w:r>
             <w:r>
               <w:rPr>
@@ -14713,7 +14713,7 @@
               <w:rPr>
                 <w:sz w:val="18"/>
               </w:rPr>
-              <w:t xml:space="preserve"> button on every screen opens the feedback form</w:t>
+              <w:t xml:space="preserve"> button in the demo is a reminder of where to send it.</w:t>
             </w:r>
           </w:p>
         </w:tc>
@@ -15351,18 +15351,18 @@
       </w:pPr>
       <w:r>
         <w:rPr/>
-        <w:t xml:space="preserve">Click </w:t>
+        <w:t xml:space="preserve">Fill in the </w:t>
       </w:r>
       <w:r>
         <w:rPr>
           <w:b/>
           <w:color w:val="0A1834"/>
         </w:rPr>
-        <w:t>Give feedback</w:t>
+        <w:t>Microsoft Form</w:t>
       </w:r>
       <w:r>
         <w:rPr/>
-        <w:t xml:space="preserve"> and tell us what you would add, change or remove.</w:t>
+        <w:t>: what you would use, what is missing, and what you would remove or change.</w:t>
       </w:r>
     </w:p>
     <w:p>

</xml_diff>